<commit_message>
Report OOP of coursework
</commit_message>
<xml_diff>
--- a/ППННИР/Дневник.docx
+++ b/ППННИР/Дневник.docx
@@ -673,20 +673,16 @@
       <w:r>
         <w:rPr>
           <w:color w:val="000000"/>
-          <w:u w:val="single"/>
+          <w:spacing w:val="-5"/>
         </w:rPr>
         <w:t xml:space="preserve"> </w:t>
       </w:r>
       <w:r>
         <w:rPr>
-          <w:rStyle w:val="FontStyle92"/>
-          <w:b w:val="0"/>
-          <w:bCs w:val="0"/>
-          <w:sz w:val="24"/>
-          <w:szCs w:val="24"/>
+          <w:color w:val="000000"/>
           <w:u w:val="single"/>
         </w:rPr>
-        <w:t>1</w:t>
+        <w:t>0</w:t>
       </w:r>
       <w:r>
         <w:rPr>
@@ -5491,6 +5487,7 @@
         <w:rPr>
           <w:color w:val="000000"/>
           <w:spacing w:val="-5"/>
+          <w:u w:val="single"/>
         </w:rPr>
       </w:pPr>
       <w:r>
@@ -5530,7 +5527,29 @@
           <w:spacing w:val="-5"/>
           <w:u w:val="single"/>
         </w:rPr>
-        <w:t>исследовательской деятельности студента</w:t>
+        <w:t>исследовательской деятельности студен</w:t>
+      </w:r>
+    </w:p>
+    <w:p>
+      <w:pPr>
+        <w:shd w:val="clear" w:color="auto" w:fill="FFFFFF"/>
+        <w:tabs>
+          <w:tab w:val="right" w:pos="6930"/>
+        </w:tabs>
+        <w:spacing w:before="80"/>
+        <w:ind w:firstLine="540"/>
+        <w:rPr>
+          <w:color w:val="000000"/>
+          <w:spacing w:val="-5"/>
+        </w:rPr>
+      </w:pPr>
+      <w:r>
+        <w:rPr>
+          <w:color w:val="000000"/>
+          <w:spacing w:val="-5"/>
+          <w:u w:val="single"/>
+        </w:rPr>
+        <w:t>та</w:t>
       </w:r>
       <w:r>
         <w:rPr>
@@ -5761,8 +5780,8 @@
         <w:tblLook w:val="0000" w:firstRow="0" w:lastRow="0" w:firstColumn="0" w:lastColumn="0" w:noHBand="0" w:noVBand="0"/>
       </w:tblPr>
       <w:tblGrid>
-        <w:gridCol w:w="1276"/>
-        <w:gridCol w:w="1307"/>
+        <w:gridCol w:w="1520"/>
+        <w:gridCol w:w="1063"/>
         <w:gridCol w:w="2975"/>
         <w:gridCol w:w="1195"/>
       </w:tblGrid>
@@ -5772,7 +5791,7 @@
         </w:trPr>
         <w:tc>
           <w:tcPr>
-            <w:tcW w:w="1276" w:type="dxa"/>
+            <w:tcW w:w="1520" w:type="dxa"/>
             <w:tcBorders>
               <w:top w:val="single" w:sz="12" w:space="0" w:color="auto"/>
               <w:left w:val="nil"/>
@@ -5805,7 +5824,7 @@
         </w:tc>
         <w:tc>
           <w:tcPr>
-            <w:tcW w:w="1307" w:type="dxa"/>
+            <w:tcW w:w="1063" w:type="dxa"/>
             <w:tcBorders>
               <w:top w:val="single" w:sz="12" w:space="0" w:color="auto"/>
               <w:bottom w:val="single" w:sz="12" w:space="0" w:color="auto"/>
@@ -5973,7 +5992,7 @@
         </w:trPr>
         <w:tc>
           <w:tcPr>
-            <w:tcW w:w="1276" w:type="dxa"/>
+            <w:tcW w:w="1520" w:type="dxa"/>
             <w:tcBorders>
               <w:top w:val="single" w:sz="12" w:space="0" w:color="auto"/>
               <w:left w:val="nil"/>
@@ -5992,6 +6011,15 @@
               <w:rPr>
                 <w:lang w:val="en-US"/>
               </w:rPr>
+              <w:t xml:space="preserve">01.09.2025 </w:t>
+            </w:r>
+            <w:r>
+              <w:t xml:space="preserve">по </w:t>
+            </w:r>
+            <w:r>
+              <w:rPr>
+                <w:lang w:val="en-US"/>
+              </w:rPr>
               <w:t>11</w:t>
             </w:r>
             <w:r>
@@ -6016,7 +6044,7 @@
         </w:tc>
         <w:tc>
           <w:tcPr>
-            <w:tcW w:w="1307" w:type="dxa"/>
+            <w:tcW w:w="1063" w:type="dxa"/>
             <w:tcBorders>
               <w:top w:val="single" w:sz="12" w:space="0" w:color="auto"/>
             </w:tcBorders>
@@ -6070,7 +6098,7 @@
         </w:trPr>
         <w:tc>
           <w:tcPr>
-            <w:tcW w:w="1276" w:type="dxa"/>
+            <w:tcW w:w="1520" w:type="dxa"/>
             <w:tcBorders>
               <w:left w:val="nil"/>
             </w:tcBorders>
@@ -6081,6 +6109,9 @@
               <w:shd w:val="clear" w:color="auto" w:fill="FFFFFF"/>
             </w:pPr>
             <w:r>
+              <w:t xml:space="preserve">11.09.2025 по </w:t>
+            </w:r>
+            <w:r>
               <w:rPr>
                 <w:lang w:val="en-US"/>
               </w:rPr>
@@ -6093,7 +6124,7 @@
         </w:tc>
         <w:tc>
           <w:tcPr>
-            <w:tcW w:w="1307" w:type="dxa"/>
+            <w:tcW w:w="1063" w:type="dxa"/>
             <w:shd w:val="clear" w:color="auto" w:fill="FFFFFF"/>
           </w:tcPr>
           <w:p>
@@ -6155,7 +6186,7 @@
         </w:trPr>
         <w:tc>
           <w:tcPr>
-            <w:tcW w:w="1276" w:type="dxa"/>
+            <w:tcW w:w="1520" w:type="dxa"/>
             <w:tcBorders>
               <w:left w:val="nil"/>
             </w:tcBorders>
@@ -6169,13 +6200,16 @@
               </w:rPr>
             </w:pPr>
             <w:r>
+              <w:t xml:space="preserve">25.09.2025 по </w:t>
+            </w:r>
+            <w:r>
               <w:t>09.10.2025</w:t>
             </w:r>
           </w:p>
         </w:tc>
         <w:tc>
           <w:tcPr>
-            <w:tcW w:w="1307" w:type="dxa"/>
+            <w:tcW w:w="1063" w:type="dxa"/>
             <w:shd w:val="clear" w:color="auto" w:fill="FFFFFF"/>
           </w:tcPr>
           <w:p>
@@ -6225,7 +6259,7 @@
         </w:trPr>
         <w:tc>
           <w:tcPr>
-            <w:tcW w:w="1276" w:type="dxa"/>
+            <w:tcW w:w="1520" w:type="dxa"/>
             <w:tcBorders>
               <w:left w:val="nil"/>
             </w:tcBorders>
@@ -6239,6 +6273,9 @@
               </w:rPr>
             </w:pPr>
             <w:r>
+              <w:t xml:space="preserve">09.10.2025 по </w:t>
+            </w:r>
+            <w:r>
               <w:t>23</w:t>
             </w:r>
             <w:r>
@@ -6251,7 +6288,7 @@
         </w:tc>
         <w:tc>
           <w:tcPr>
-            <w:tcW w:w="1307" w:type="dxa"/>
+            <w:tcW w:w="1063" w:type="dxa"/>
             <w:shd w:val="clear" w:color="auto" w:fill="FFFFFF"/>
           </w:tcPr>
           <w:p>
@@ -6301,7 +6338,7 @@
         </w:trPr>
         <w:tc>
           <w:tcPr>
-            <w:tcW w:w="1276" w:type="dxa"/>
+            <w:tcW w:w="1520" w:type="dxa"/>
             <w:tcBorders>
               <w:left w:val="nil"/>
             </w:tcBorders>
@@ -6315,6 +6352,9 @@
               </w:rPr>
             </w:pPr>
             <w:r>
+              <w:t xml:space="preserve">23.10.2025 по </w:t>
+            </w:r>
+            <w:r>
               <w:rPr>
                 <w:lang w:val="en-US"/>
               </w:rPr>
@@ -6324,7 +6364,7 @@
         </w:tc>
         <w:tc>
           <w:tcPr>
-            <w:tcW w:w="1307" w:type="dxa"/>
+            <w:tcW w:w="1063" w:type="dxa"/>
             <w:shd w:val="clear" w:color="auto" w:fill="FFFFFF"/>
           </w:tcPr>
           <w:p>
@@ -6371,7 +6411,7 @@
         </w:trPr>
         <w:tc>
           <w:tcPr>
-            <w:tcW w:w="1276" w:type="dxa"/>
+            <w:tcW w:w="1520" w:type="dxa"/>
             <w:tcBorders>
               <w:left w:val="nil"/>
             </w:tcBorders>
@@ -6385,6 +6425,9 @@
               </w:rPr>
             </w:pPr>
             <w:r>
+              <w:t xml:space="preserve">06.11.2025 по </w:t>
+            </w:r>
+            <w:r>
               <w:rPr>
                 <w:lang w:val="en-US"/>
               </w:rPr>
@@ -6394,7 +6437,7 @@
         </w:tc>
         <w:tc>
           <w:tcPr>
-            <w:tcW w:w="1307" w:type="dxa"/>
+            <w:tcW w:w="1063" w:type="dxa"/>
             <w:shd w:val="clear" w:color="auto" w:fill="FFFFFF"/>
           </w:tcPr>
           <w:p>
@@ -6450,7 +6493,7 @@
         </w:trPr>
         <w:tc>
           <w:tcPr>
-            <w:tcW w:w="1276" w:type="dxa"/>
+            <w:tcW w:w="1520" w:type="dxa"/>
             <w:tcBorders>
               <w:left w:val="nil"/>
             </w:tcBorders>
@@ -6465,6 +6508,9 @@
               </w:rPr>
             </w:pPr>
             <w:r>
+              <w:t xml:space="preserve">20.11.2025 по </w:t>
+            </w:r>
+            <w:r>
               <w:rPr>
                 <w:lang w:val="en-US"/>
               </w:rPr>
@@ -6474,7 +6520,7 @@
         </w:tc>
         <w:tc>
           <w:tcPr>
-            <w:tcW w:w="1307" w:type="dxa"/>
+            <w:tcW w:w="1063" w:type="dxa"/>
             <w:shd w:val="clear" w:color="auto" w:fill="FFFFFF"/>
           </w:tcPr>
           <w:p>
@@ -6521,7 +6567,7 @@
         </w:trPr>
         <w:tc>
           <w:tcPr>
-            <w:tcW w:w="1276" w:type="dxa"/>
+            <w:tcW w:w="1520" w:type="dxa"/>
             <w:tcBorders>
               <w:left w:val="nil"/>
             </w:tcBorders>
@@ -6535,17 +6581,20 @@
               </w:rPr>
             </w:pPr>
             <w:r>
+              <w:lastRenderedPageBreak/>
+              <w:t xml:space="preserve">22.11.2025 по </w:t>
+            </w:r>
+            <w:r>
               <w:rPr>
                 <w:lang w:val="en-US"/>
               </w:rPr>
-              <w:lastRenderedPageBreak/>
               <w:t>25.11.2025</w:t>
             </w:r>
           </w:p>
         </w:tc>
         <w:tc>
           <w:tcPr>
-            <w:tcW w:w="1307" w:type="dxa"/>
+            <w:tcW w:w="1063" w:type="dxa"/>
             <w:shd w:val="clear" w:color="auto" w:fill="FFFFFF"/>
           </w:tcPr>
           <w:p>
@@ -6596,11 +6645,11 @@
       </w:tr>
       <w:tr>
         <w:trPr>
-          <w:trHeight w:hRule="exact" w:val="1872"/>
+          <w:trHeight w:hRule="exact" w:val="1730"/>
         </w:trPr>
         <w:tc>
           <w:tcPr>
-            <w:tcW w:w="1276" w:type="dxa"/>
+            <w:tcW w:w="1520" w:type="dxa"/>
             <w:tcBorders>
               <w:left w:val="nil"/>
             </w:tcBorders>
@@ -6614,6 +6663,9 @@
               </w:rPr>
             </w:pPr>
             <w:r>
+              <w:t xml:space="preserve">25.11.2025 по </w:t>
+            </w:r>
+            <w:r>
               <w:rPr>
                 <w:lang w:val="en-US"/>
               </w:rPr>
@@ -6623,7 +6675,7 @@
         </w:tc>
         <w:tc>
           <w:tcPr>
-            <w:tcW w:w="1307" w:type="dxa"/>
+            <w:tcW w:w="1063" w:type="dxa"/>
             <w:shd w:val="clear" w:color="auto" w:fill="FFFFFF"/>
           </w:tcPr>
           <w:p>
@@ -6679,7 +6731,7 @@
         </w:trPr>
         <w:tc>
           <w:tcPr>
-            <w:tcW w:w="1276" w:type="dxa"/>
+            <w:tcW w:w="1520" w:type="dxa"/>
             <w:tcBorders>
               <w:left w:val="nil"/>
             </w:tcBorders>
@@ -6693,16 +6745,19 @@
               </w:rPr>
             </w:pPr>
             <w:r>
+              <w:t>29.11.2025 по 17</w:t>
+            </w:r>
+            <w:r>
               <w:rPr>
                 <w:lang w:val="en-US"/>
               </w:rPr>
-              <w:t>01.12.2025</w:t>
-            </w:r>
-          </w:p>
-        </w:tc>
-        <w:tc>
-          <w:tcPr>
-            <w:tcW w:w="1307" w:type="dxa"/>
+              <w:t>.12.2025</w:t>
+            </w:r>
+          </w:p>
+        </w:tc>
+        <w:tc>
+          <w:tcPr>
+            <w:tcW w:w="1063" w:type="dxa"/>
             <w:shd w:val="clear" w:color="auto" w:fill="FFFFFF"/>
           </w:tcPr>
           <w:p>
@@ -6725,6 +6780,98 @@
             </w:pPr>
             <w:r>
               <w:t>Оформление итогового отчета по практике</w:t>
+            </w:r>
+          </w:p>
+        </w:tc>
+        <w:tc>
+          <w:tcPr>
+            <w:tcW w:w="1195" w:type="dxa"/>
+            <w:tcBorders>
+              <w:right w:val="nil"/>
+            </w:tcBorders>
+            <w:shd w:val="clear" w:color="auto" w:fill="FFFFFF"/>
+          </w:tcPr>
+          <w:p>
+            <w:pPr>
+              <w:shd w:val="clear" w:color="auto" w:fill="FFFFFF"/>
+            </w:pPr>
+          </w:p>
+        </w:tc>
+      </w:tr>
+      <w:tr>
+        <w:trPr>
+          <w:trHeight w:hRule="exact" w:val="711"/>
+        </w:trPr>
+        <w:tc>
+          <w:tcPr>
+            <w:tcW w:w="1520" w:type="dxa"/>
+            <w:tcBorders>
+              <w:left w:val="nil"/>
+            </w:tcBorders>
+            <w:shd w:val="clear" w:color="auto" w:fill="FFFFFF"/>
+          </w:tcPr>
+          <w:p>
+            <w:pPr>
+              <w:shd w:val="clear" w:color="auto" w:fill="FFFFFF"/>
+              <w:rPr>
+                <w:highlight w:val="yellow"/>
+                <w:lang w:val="en-US"/>
+              </w:rPr>
+            </w:pPr>
+            <w:r>
+              <w:t>1</w:t>
+            </w:r>
+            <w:r>
+              <w:rPr>
+                <w:lang w:val="en-US"/>
+              </w:rPr>
+              <w:t>8</w:t>
+            </w:r>
+            <w:r>
+              <w:t>.</w:t>
+            </w:r>
+            <w:r>
+              <w:rPr>
+                <w:lang w:val="en-US"/>
+              </w:rPr>
+              <w:t>12</w:t>
+            </w:r>
+            <w:r>
+              <w:t>.202</w:t>
+            </w:r>
+            <w:r>
+              <w:rPr>
+                <w:lang w:val="en-US"/>
+              </w:rPr>
+              <w:t>5</w:t>
+            </w:r>
+          </w:p>
+        </w:tc>
+        <w:tc>
+          <w:tcPr>
+            <w:tcW w:w="1063" w:type="dxa"/>
+            <w:shd w:val="clear" w:color="auto" w:fill="FFFFFF"/>
+          </w:tcPr>
+          <w:p>
+            <w:pPr>
+              <w:shd w:val="clear" w:color="auto" w:fill="FFFFFF"/>
+            </w:pPr>
+            <w:r>
+              <w:t>каф. ЭМИС</w:t>
+            </w:r>
+          </w:p>
+        </w:tc>
+        <w:tc>
+          <w:tcPr>
+            <w:tcW w:w="2975" w:type="dxa"/>
+            <w:shd w:val="clear" w:color="auto" w:fill="FFFFFF"/>
+          </w:tcPr>
+          <w:p>
+            <w:pPr>
+              <w:shd w:val="clear" w:color="auto" w:fill="FFFFFF"/>
+            </w:pPr>
+            <w:r>
+              <w:t>Защита отчета по практике</w:t>
             </w:r>
           </w:p>
         </w:tc>
@@ -6749,7 +6896,7 @@
         </w:trPr>
         <w:tc>
           <w:tcPr>
-            <w:tcW w:w="1276" w:type="dxa"/>
+            <w:tcW w:w="1520" w:type="dxa"/>
             <w:tcBorders>
               <w:left w:val="nil"/>
             </w:tcBorders>
@@ -6758,52 +6905,18 @@
           <w:p>
             <w:pPr>
               <w:shd w:val="clear" w:color="auto" w:fill="FFFFFF"/>
-              <w:rPr>
-                <w:highlight w:val="yellow"/>
-                <w:lang w:val="en-US"/>
-              </w:rPr>
-            </w:pPr>
-            <w:r>
-              <w:t>1</w:t>
-            </w:r>
-            <w:r>
-              <w:rPr>
-                <w:lang w:val="en-US"/>
-              </w:rPr>
-              <w:t>8</w:t>
-            </w:r>
-            <w:r>
-              <w:t>.</w:t>
-            </w:r>
-            <w:r>
-              <w:rPr>
-                <w:lang w:val="en-US"/>
-              </w:rPr>
-              <w:t>12</w:t>
-            </w:r>
-            <w:r>
-              <w:t>.202</w:t>
-            </w:r>
-            <w:r>
-              <w:rPr>
-                <w:lang w:val="en-US"/>
-              </w:rPr>
-              <w:t>5</w:t>
-            </w:r>
-          </w:p>
-        </w:tc>
-        <w:tc>
-          <w:tcPr>
-            <w:tcW w:w="1307" w:type="dxa"/>
-            <w:shd w:val="clear" w:color="auto" w:fill="FFFFFF"/>
-          </w:tcPr>
-          <w:p>
-            <w:pPr>
-              <w:shd w:val="clear" w:color="auto" w:fill="FFFFFF"/>
-            </w:pPr>
-            <w:r>
-              <w:t>каф. ЭМИС</w:t>
-            </w:r>
+            </w:pPr>
+          </w:p>
+        </w:tc>
+        <w:tc>
+          <w:tcPr>
+            <w:tcW w:w="1063" w:type="dxa"/>
+            <w:shd w:val="clear" w:color="auto" w:fill="FFFFFF"/>
+          </w:tcPr>
+          <w:p>
+            <w:pPr>
+              <w:shd w:val="clear" w:color="auto" w:fill="FFFFFF"/>
+            </w:pPr>
           </w:p>
         </w:tc>
         <w:tc>
@@ -6815,9 +6928,6 @@
             <w:pPr>
               <w:shd w:val="clear" w:color="auto" w:fill="FFFFFF"/>
             </w:pPr>
-            <w:r>
-              <w:t>Защита отчета по практике</w:t>
-            </w:r>
           </w:p>
         </w:tc>
         <w:tc>
@@ -6841,7 +6951,7 @@
         </w:trPr>
         <w:tc>
           <w:tcPr>
-            <w:tcW w:w="1276" w:type="dxa"/>
+            <w:tcW w:w="1520" w:type="dxa"/>
             <w:tcBorders>
               <w:left w:val="nil"/>
             </w:tcBorders>
@@ -6855,7 +6965,7 @@
         </w:tc>
         <w:tc>
           <w:tcPr>
-            <w:tcW w:w="1307" w:type="dxa"/>
+            <w:tcW w:w="1063" w:type="dxa"/>
             <w:shd w:val="clear" w:color="auto" w:fill="FFFFFF"/>
           </w:tcPr>
           <w:p>
@@ -6896,7 +7006,7 @@
         </w:trPr>
         <w:tc>
           <w:tcPr>
-            <w:tcW w:w="1276" w:type="dxa"/>
+            <w:tcW w:w="1520" w:type="dxa"/>
             <w:tcBorders>
               <w:left w:val="nil"/>
             </w:tcBorders>
@@ -6910,7 +7020,7 @@
         </w:tc>
         <w:tc>
           <w:tcPr>
-            <w:tcW w:w="1307" w:type="dxa"/>
+            <w:tcW w:w="1063" w:type="dxa"/>
             <w:shd w:val="clear" w:color="auto" w:fill="FFFFFF"/>
           </w:tcPr>
           <w:p>
@@ -6951,7 +7061,7 @@
         </w:trPr>
         <w:tc>
           <w:tcPr>
-            <w:tcW w:w="1276" w:type="dxa"/>
+            <w:tcW w:w="1520" w:type="dxa"/>
             <w:tcBorders>
               <w:left w:val="nil"/>
             </w:tcBorders>
@@ -6965,7 +7075,7 @@
         </w:tc>
         <w:tc>
           <w:tcPr>
-            <w:tcW w:w="1307" w:type="dxa"/>
+            <w:tcW w:w="1063" w:type="dxa"/>
             <w:shd w:val="clear" w:color="auto" w:fill="FFFFFF"/>
           </w:tcPr>
           <w:p>
@@ -7006,7 +7116,7 @@
         </w:trPr>
         <w:tc>
           <w:tcPr>
-            <w:tcW w:w="1276" w:type="dxa"/>
+            <w:tcW w:w="1520" w:type="dxa"/>
             <w:tcBorders>
               <w:left w:val="nil"/>
             </w:tcBorders>
@@ -7020,7 +7130,7 @@
         </w:tc>
         <w:tc>
           <w:tcPr>
-            <w:tcW w:w="1307" w:type="dxa"/>
+            <w:tcW w:w="1063" w:type="dxa"/>
             <w:shd w:val="clear" w:color="auto" w:fill="FFFFFF"/>
           </w:tcPr>
           <w:p>
@@ -7061,7 +7171,7 @@
         </w:trPr>
         <w:tc>
           <w:tcPr>
-            <w:tcW w:w="1276" w:type="dxa"/>
+            <w:tcW w:w="1520" w:type="dxa"/>
             <w:tcBorders>
               <w:left w:val="nil"/>
             </w:tcBorders>
@@ -7075,7 +7185,7 @@
         </w:tc>
         <w:tc>
           <w:tcPr>
-            <w:tcW w:w="1307" w:type="dxa"/>
+            <w:tcW w:w="1063" w:type="dxa"/>
             <w:shd w:val="clear" w:color="auto" w:fill="FFFFFF"/>
           </w:tcPr>
           <w:p>
@@ -7116,7 +7226,7 @@
         </w:trPr>
         <w:tc>
           <w:tcPr>
-            <w:tcW w:w="1276" w:type="dxa"/>
+            <w:tcW w:w="1520" w:type="dxa"/>
             <w:tcBorders>
               <w:left w:val="nil"/>
             </w:tcBorders>
@@ -7130,7 +7240,7 @@
         </w:tc>
         <w:tc>
           <w:tcPr>
-            <w:tcW w:w="1307" w:type="dxa"/>
+            <w:tcW w:w="1063" w:type="dxa"/>
             <w:shd w:val="clear" w:color="auto" w:fill="FFFFFF"/>
           </w:tcPr>
           <w:p>
@@ -7171,7 +7281,7 @@
         </w:trPr>
         <w:tc>
           <w:tcPr>
-            <w:tcW w:w="1276" w:type="dxa"/>
+            <w:tcW w:w="1520" w:type="dxa"/>
             <w:tcBorders>
               <w:left w:val="nil"/>
             </w:tcBorders>
@@ -7185,7 +7295,7 @@
         </w:tc>
         <w:tc>
           <w:tcPr>
-            <w:tcW w:w="1307" w:type="dxa"/>
+            <w:tcW w:w="1063" w:type="dxa"/>
             <w:shd w:val="clear" w:color="auto" w:fill="FFFFFF"/>
           </w:tcPr>
           <w:p>
@@ -7226,7 +7336,7 @@
         </w:trPr>
         <w:tc>
           <w:tcPr>
-            <w:tcW w:w="1276" w:type="dxa"/>
+            <w:tcW w:w="1520" w:type="dxa"/>
             <w:tcBorders>
               <w:left w:val="nil"/>
             </w:tcBorders>
@@ -7240,7 +7350,7 @@
         </w:tc>
         <w:tc>
           <w:tcPr>
-            <w:tcW w:w="1307" w:type="dxa"/>
+            <w:tcW w:w="1063" w:type="dxa"/>
             <w:shd w:val="clear" w:color="auto" w:fill="FFFFFF"/>
           </w:tcPr>
           <w:p>
@@ -7281,7 +7391,7 @@
         </w:trPr>
         <w:tc>
           <w:tcPr>
-            <w:tcW w:w="1276" w:type="dxa"/>
+            <w:tcW w:w="1520" w:type="dxa"/>
             <w:tcBorders>
               <w:left w:val="nil"/>
             </w:tcBorders>
@@ -7295,7 +7405,62 @@
         </w:tc>
         <w:tc>
           <w:tcPr>
-            <w:tcW w:w="1307" w:type="dxa"/>
+            <w:tcW w:w="1063" w:type="dxa"/>
+            <w:shd w:val="clear" w:color="auto" w:fill="FFFFFF"/>
+          </w:tcPr>
+          <w:p>
+            <w:pPr>
+              <w:shd w:val="clear" w:color="auto" w:fill="FFFFFF"/>
+            </w:pPr>
+          </w:p>
+        </w:tc>
+        <w:tc>
+          <w:tcPr>
+            <w:tcW w:w="2975" w:type="dxa"/>
+            <w:shd w:val="clear" w:color="auto" w:fill="FFFFFF"/>
+          </w:tcPr>
+          <w:p>
+            <w:pPr>
+              <w:shd w:val="clear" w:color="auto" w:fill="FFFFFF"/>
+            </w:pPr>
+          </w:p>
+        </w:tc>
+        <w:tc>
+          <w:tcPr>
+            <w:tcW w:w="1195" w:type="dxa"/>
+            <w:tcBorders>
+              <w:right w:val="nil"/>
+            </w:tcBorders>
+            <w:shd w:val="clear" w:color="auto" w:fill="FFFFFF"/>
+          </w:tcPr>
+          <w:p>
+            <w:pPr>
+              <w:shd w:val="clear" w:color="auto" w:fill="FFFFFF"/>
+            </w:pPr>
+          </w:p>
+        </w:tc>
+      </w:tr>
+      <w:tr>
+        <w:trPr>
+          <w:trHeight w:hRule="exact" w:val="310"/>
+        </w:trPr>
+        <w:tc>
+          <w:tcPr>
+            <w:tcW w:w="1520" w:type="dxa"/>
+            <w:tcBorders>
+              <w:left w:val="nil"/>
+            </w:tcBorders>
+            <w:shd w:val="clear" w:color="auto" w:fill="FFFFFF"/>
+          </w:tcPr>
+          <w:p>
+            <w:pPr>
+              <w:shd w:val="clear" w:color="auto" w:fill="FFFFFF"/>
+            </w:pPr>
+          </w:p>
+        </w:tc>
+        <w:tc>
+          <w:tcPr>
+            <w:tcW w:w="1063" w:type="dxa"/>
             <w:shd w:val="clear" w:color="auto" w:fill="FFFFFF"/>
           </w:tcPr>
           <w:p>
@@ -7336,117 +7501,7 @@
         </w:trPr>
         <w:tc>
           <w:tcPr>
-            <w:tcW w:w="1276" w:type="dxa"/>
-            <w:tcBorders>
-              <w:left w:val="nil"/>
-            </w:tcBorders>
-            <w:shd w:val="clear" w:color="auto" w:fill="FFFFFF"/>
-          </w:tcPr>
-          <w:p>
-            <w:pPr>
-              <w:shd w:val="clear" w:color="auto" w:fill="FFFFFF"/>
-            </w:pPr>
-          </w:p>
-        </w:tc>
-        <w:tc>
-          <w:tcPr>
-            <w:tcW w:w="1307" w:type="dxa"/>
-            <w:shd w:val="clear" w:color="auto" w:fill="FFFFFF"/>
-          </w:tcPr>
-          <w:p>
-            <w:pPr>
-              <w:shd w:val="clear" w:color="auto" w:fill="FFFFFF"/>
-            </w:pPr>
-          </w:p>
-        </w:tc>
-        <w:tc>
-          <w:tcPr>
-            <w:tcW w:w="2975" w:type="dxa"/>
-            <w:shd w:val="clear" w:color="auto" w:fill="FFFFFF"/>
-          </w:tcPr>
-          <w:p>
-            <w:pPr>
-              <w:shd w:val="clear" w:color="auto" w:fill="FFFFFF"/>
-            </w:pPr>
-          </w:p>
-        </w:tc>
-        <w:tc>
-          <w:tcPr>
-            <w:tcW w:w="1195" w:type="dxa"/>
-            <w:tcBorders>
-              <w:right w:val="nil"/>
-            </w:tcBorders>
-            <w:shd w:val="clear" w:color="auto" w:fill="FFFFFF"/>
-          </w:tcPr>
-          <w:p>
-            <w:pPr>
-              <w:shd w:val="clear" w:color="auto" w:fill="FFFFFF"/>
-            </w:pPr>
-          </w:p>
-        </w:tc>
-      </w:tr>
-      <w:tr>
-        <w:trPr>
-          <w:trHeight w:hRule="exact" w:val="310"/>
-        </w:trPr>
-        <w:tc>
-          <w:tcPr>
-            <w:tcW w:w="1276" w:type="dxa"/>
-            <w:tcBorders>
-              <w:left w:val="nil"/>
-            </w:tcBorders>
-            <w:shd w:val="clear" w:color="auto" w:fill="FFFFFF"/>
-          </w:tcPr>
-          <w:p>
-            <w:pPr>
-              <w:shd w:val="clear" w:color="auto" w:fill="FFFFFF"/>
-            </w:pPr>
-          </w:p>
-        </w:tc>
-        <w:tc>
-          <w:tcPr>
-            <w:tcW w:w="1307" w:type="dxa"/>
-            <w:shd w:val="clear" w:color="auto" w:fill="FFFFFF"/>
-          </w:tcPr>
-          <w:p>
-            <w:pPr>
-              <w:shd w:val="clear" w:color="auto" w:fill="FFFFFF"/>
-            </w:pPr>
-          </w:p>
-        </w:tc>
-        <w:tc>
-          <w:tcPr>
-            <w:tcW w:w="2975" w:type="dxa"/>
-            <w:shd w:val="clear" w:color="auto" w:fill="FFFFFF"/>
-          </w:tcPr>
-          <w:p>
-            <w:pPr>
-              <w:shd w:val="clear" w:color="auto" w:fill="FFFFFF"/>
-            </w:pPr>
-          </w:p>
-        </w:tc>
-        <w:tc>
-          <w:tcPr>
-            <w:tcW w:w="1195" w:type="dxa"/>
-            <w:tcBorders>
-              <w:right w:val="nil"/>
-            </w:tcBorders>
-            <w:shd w:val="clear" w:color="auto" w:fill="FFFFFF"/>
-          </w:tcPr>
-          <w:p>
-            <w:pPr>
-              <w:shd w:val="clear" w:color="auto" w:fill="FFFFFF"/>
-            </w:pPr>
-          </w:p>
-        </w:tc>
-      </w:tr>
-      <w:tr>
-        <w:trPr>
-          <w:trHeight w:hRule="exact" w:val="317"/>
-        </w:trPr>
-        <w:tc>
-          <w:tcPr>
-            <w:tcW w:w="1276" w:type="dxa"/>
+            <w:tcW w:w="1520" w:type="dxa"/>
             <w:tcBorders>
               <w:left w:val="nil"/>
               <w:bottom w:val="nil"/>
@@ -7461,7 +7516,7 @@
         </w:tc>
         <w:tc>
           <w:tcPr>
-            <w:tcW w:w="1307" w:type="dxa"/>
+            <w:tcW w:w="1063" w:type="dxa"/>
             <w:tcBorders>
               <w:bottom w:val="nil"/>
             </w:tcBorders>
@@ -12625,7 +12680,14 @@
                 <w:sz w:val="20"/>
                 <w:szCs w:val="20"/>
               </w:rPr>
-              <w:t>11</w:t>
+              <w:t>0</w:t>
+            </w:r>
+            <w:r>
+              <w:rPr>
+                <w:sz w:val="20"/>
+                <w:szCs w:val="20"/>
+              </w:rPr>
+              <w:t>1</w:t>
             </w:r>
             <w:r>
               <w:rPr>
@@ -12757,7 +12819,14 @@
                 <w:sz w:val="20"/>
                 <w:szCs w:val="20"/>
               </w:rPr>
-              <w:t>11</w:t>
+              <w:t>0</w:t>
+            </w:r>
+            <w:r>
+              <w:rPr>
+                <w:sz w:val="20"/>
+                <w:szCs w:val="20"/>
+              </w:rPr>
+              <w:t>1</w:t>
             </w:r>
             <w:r>
               <w:rPr>
@@ -12889,7 +12958,14 @@
                 <w:sz w:val="20"/>
                 <w:szCs w:val="20"/>
               </w:rPr>
-              <w:t>11</w:t>
+              <w:t>0</w:t>
+            </w:r>
+            <w:r>
+              <w:rPr>
+                <w:sz w:val="20"/>
+                <w:szCs w:val="20"/>
+              </w:rPr>
+              <w:t>1</w:t>
             </w:r>
             <w:r>
               <w:rPr>
@@ -13035,7 +13111,14 @@
                 <w:sz w:val="20"/>
                 <w:szCs w:val="20"/>
               </w:rPr>
-              <w:t>11</w:t>
+              <w:t>0</w:t>
+            </w:r>
+            <w:r>
+              <w:rPr>
+                <w:sz w:val="20"/>
+                <w:szCs w:val="20"/>
+              </w:rPr>
+              <w:t>1</w:t>
             </w:r>
             <w:r>
               <w:rPr>
@@ -17397,91 +17480,91 @@
       </w:rPr>
     </w:lvl>
   </w:abstractNum>
-  <w:num w:numId="1" w16cid:durableId="2008631362">
+  <w:num w:numId="1" w16cid:durableId="1894845065">
     <w:abstractNumId w:val="15"/>
   </w:num>
-  <w:num w:numId="2" w16cid:durableId="95442995">
+  <w:num w:numId="2" w16cid:durableId="1925217036">
     <w:abstractNumId w:val="19"/>
   </w:num>
-  <w:num w:numId="3" w16cid:durableId="530338207">
+  <w:num w:numId="3" w16cid:durableId="853156997">
     <w:abstractNumId w:val="14"/>
   </w:num>
-  <w:num w:numId="4" w16cid:durableId="502163351">
+  <w:num w:numId="4" w16cid:durableId="2096440777">
     <w:abstractNumId w:val="10"/>
   </w:num>
-  <w:num w:numId="5" w16cid:durableId="950936391">
+  <w:num w:numId="5" w16cid:durableId="998997065">
     <w:abstractNumId w:val="18"/>
   </w:num>
-  <w:num w:numId="6" w16cid:durableId="1797525191">
+  <w:num w:numId="6" w16cid:durableId="1346054189">
     <w:abstractNumId w:val="8"/>
   </w:num>
-  <w:num w:numId="7" w16cid:durableId="511183070">
+  <w:num w:numId="7" w16cid:durableId="1071389758">
     <w:abstractNumId w:val="6"/>
   </w:num>
-  <w:num w:numId="8" w16cid:durableId="81068407">
+  <w:num w:numId="8" w16cid:durableId="128282282">
     <w:abstractNumId w:val="20"/>
   </w:num>
-  <w:num w:numId="9" w16cid:durableId="709695290">
+  <w:num w:numId="9" w16cid:durableId="2063092432">
     <w:abstractNumId w:val="16"/>
   </w:num>
-  <w:num w:numId="10" w16cid:durableId="1854997910">
+  <w:num w:numId="10" w16cid:durableId="70784372">
     <w:abstractNumId w:val="25"/>
   </w:num>
-  <w:num w:numId="11" w16cid:durableId="1820532472">
+  <w:num w:numId="11" w16cid:durableId="1898976481">
     <w:abstractNumId w:val="5"/>
   </w:num>
-  <w:num w:numId="12" w16cid:durableId="82185783">
+  <w:num w:numId="12" w16cid:durableId="1209490178">
     <w:abstractNumId w:val="24"/>
   </w:num>
-  <w:num w:numId="13" w16cid:durableId="626199116">
+  <w:num w:numId="13" w16cid:durableId="1949193770">
     <w:abstractNumId w:val="9"/>
   </w:num>
-  <w:num w:numId="14" w16cid:durableId="1280995157">
+  <w:num w:numId="14" w16cid:durableId="1038315344">
     <w:abstractNumId w:val="26"/>
   </w:num>
-  <w:num w:numId="15" w16cid:durableId="50927489">
+  <w:num w:numId="15" w16cid:durableId="1424763798">
     <w:abstractNumId w:val="2"/>
   </w:num>
-  <w:num w:numId="16" w16cid:durableId="1483736580">
+  <w:num w:numId="16" w16cid:durableId="366032399">
     <w:abstractNumId w:val="11"/>
   </w:num>
-  <w:num w:numId="17" w16cid:durableId="338777028">
+  <w:num w:numId="17" w16cid:durableId="494344065">
     <w:abstractNumId w:val="3"/>
   </w:num>
-  <w:num w:numId="18" w16cid:durableId="520242013">
+  <w:num w:numId="18" w16cid:durableId="966471790">
     <w:abstractNumId w:val="17"/>
   </w:num>
-  <w:num w:numId="19" w16cid:durableId="682980357">
+  <w:num w:numId="19" w16cid:durableId="638462427">
     <w:abstractNumId w:val="13"/>
   </w:num>
-  <w:num w:numId="20" w16cid:durableId="1905334582">
+  <w:num w:numId="20" w16cid:durableId="100493825">
     <w:abstractNumId w:val="4"/>
   </w:num>
-  <w:num w:numId="21" w16cid:durableId="97481823">
+  <w:num w:numId="21" w16cid:durableId="387068271">
     <w:abstractNumId w:val="21"/>
   </w:num>
-  <w:num w:numId="22" w16cid:durableId="1070736627">
+  <w:num w:numId="22" w16cid:durableId="898328260">
     <w:abstractNumId w:val="12"/>
   </w:num>
-  <w:num w:numId="23" w16cid:durableId="1171066969">
+  <w:num w:numId="23" w16cid:durableId="2145727904">
     <w:abstractNumId w:val="22"/>
   </w:num>
-  <w:num w:numId="24" w16cid:durableId="52429805">
+  <w:num w:numId="24" w16cid:durableId="429205200">
     <w:abstractNumId w:val="7"/>
   </w:num>
-  <w:num w:numId="25" w16cid:durableId="297348044">
+  <w:num w:numId="25" w16cid:durableId="1373732039">
     <w:abstractNumId w:val="0"/>
   </w:num>
-  <w:num w:numId="26" w16cid:durableId="1902673460">
+  <w:num w:numId="26" w16cid:durableId="1321889338">
     <w:abstractNumId w:val="1"/>
   </w:num>
-  <w:num w:numId="27" w16cid:durableId="87849722">
+  <w:num w:numId="27" w16cid:durableId="608702282">
     <w:abstractNumId w:val="23"/>
   </w:num>
-  <w:num w:numId="28" w16cid:durableId="1113552931">
+  <w:num w:numId="28" w16cid:durableId="2020155425">
     <w:abstractNumId w:val="27"/>
   </w:num>
-  <w:num w:numId="29" w16cid:durableId="548763666">
+  <w:num w:numId="29" w16cid:durableId="737169336">
     <w:abstractNumId w:val="15"/>
     <w:lvlOverride w:ilvl="0">
       <w:startOverride w:val="6"/>

</xml_diff>